<commit_message>
Fixed typos in the build manual.
Fixed wrong forward and backward slashes.
</commit_message>
<xml_diff>
--- a/freefalcon build manual.docx
+++ b/freefalcon build manual.docx
@@ -4921,20 +4921,12 @@
       <w:r>
         <w:rPr>
           <w:rFonts w:asciiTheme="minorBidi" w:hAnsiTheme="minorBidi"/>
-          <w:sz w:val="20"/>
-          <w:szCs w:val="20"/>
-        </w:rPr>
-        <w:t xml:space="preserve"> </w:t>
-      </w:r>
-      <w:r>
-        <w:rPr>
-          <w:rFonts w:asciiTheme="minorBidi" w:hAnsiTheme="minorBidi"/>
-          <w:b/>
-          <w:bCs/>
-          <w:sz w:val="20"/>
-          <w:szCs w:val="20"/>
-        </w:rPr>
-        <w:t>/</w:t>
+          <w:b/>
+          <w:bCs/>
+          <w:sz w:val="20"/>
+          <w:szCs w:val="20"/>
+        </w:rPr>
+        <w:t>\</w:t>
       </w:r>
       <w:proofErr w:type="spellStart"/>
       <w:r>
@@ -4974,7 +4966,17 @@
           <w:sz w:val="20"/>
           <w:szCs w:val="20"/>
         </w:rPr>
-        <w:t>/config</w:t>
+        <w:t>\</w:t>
+      </w:r>
+      <w:r>
+        <w:rPr>
+          <w:rFonts w:asciiTheme="minorBidi" w:hAnsiTheme="minorBidi"/>
+          <w:b/>
+          <w:bCs/>
+          <w:sz w:val="20"/>
+          <w:szCs w:val="20"/>
+        </w:rPr>
+        <w:t>config</w:t>
       </w:r>
       <w:r>
         <w:rPr>
@@ -8873,890 +8875,910 @@
         </w:rPr>
         <w:t xml:space="preserve">Save that new </w:t>
       </w:r>
+      <w:r>
+        <w:rPr>
+          <w:rFonts w:asciiTheme="minorBidi" w:hAnsiTheme="minorBidi"/>
+          <w:b/>
+          <w:bCs/>
+          <w:sz w:val="20"/>
+          <w:szCs w:val="20"/>
+        </w:rPr>
+        <w:t>URL</w:t>
+      </w:r>
+      <w:r>
+        <w:rPr>
+          <w:rFonts w:asciiTheme="minorBidi" w:hAnsiTheme="minorBidi"/>
+          <w:sz w:val="20"/>
+          <w:szCs w:val="20"/>
+        </w:rPr>
+        <w:t xml:space="preserve"> in your browser’s bookmarks.</w:t>
+      </w:r>
+    </w:p>
+    <w:p>
+      <w:pPr>
+        <w:pStyle w:val="a3"/>
+        <w:numPr>
+          <w:ilvl w:val="1"/>
+          <w:numId w:val="2"/>
+        </w:numPr>
+        <w:ind w:left="1276" w:hanging="567"/>
+        <w:rPr>
+          <w:rFonts w:asciiTheme="minorBidi" w:hAnsiTheme="minorBidi"/>
+          <w:sz w:val="20"/>
+          <w:szCs w:val="20"/>
+        </w:rPr>
+      </w:pPr>
+      <w:r>
+        <w:rPr>
+          <w:rFonts w:asciiTheme="minorBidi" w:hAnsiTheme="minorBidi"/>
+          <w:sz w:val="20"/>
+          <w:szCs w:val="20"/>
+        </w:rPr>
+        <w:t xml:space="preserve">Click the </w:t>
+      </w:r>
+      <w:r>
+        <w:rPr>
+          <w:rFonts w:asciiTheme="minorBidi" w:hAnsiTheme="minorBidi"/>
+          <w:b/>
+          <w:bCs/>
+          <w:sz w:val="20"/>
+          <w:szCs w:val="20"/>
+        </w:rPr>
+        <w:t>Clone in Desktop</w:t>
+      </w:r>
+      <w:r>
+        <w:rPr>
+          <w:rFonts w:asciiTheme="minorBidi" w:hAnsiTheme="minorBidi"/>
+          <w:sz w:val="20"/>
+          <w:szCs w:val="20"/>
+        </w:rPr>
+        <w:t xml:space="preserve"> icon</w:t>
+      </w:r>
+      <w:r>
+        <w:rPr>
+          <w:rFonts w:asciiTheme="minorBidi" w:hAnsiTheme="minorBidi"/>
+          <w:sz w:val="20"/>
+          <w:szCs w:val="20"/>
+        </w:rPr>
+        <w:t xml:space="preserve"> at the lower right of the screen.</w:t>
+      </w:r>
+    </w:p>
+    <w:p>
+      <w:pPr>
+        <w:pStyle w:val="a3"/>
+        <w:numPr>
+          <w:ilvl w:val="1"/>
+          <w:numId w:val="2"/>
+        </w:numPr>
+        <w:ind w:left="1276" w:hanging="567"/>
+        <w:rPr>
+          <w:rFonts w:asciiTheme="minorBidi" w:hAnsiTheme="minorBidi"/>
+          <w:sz w:val="20"/>
+          <w:szCs w:val="20"/>
+        </w:rPr>
+      </w:pPr>
+      <w:r>
+        <w:rPr>
+          <w:rFonts w:asciiTheme="minorBidi" w:hAnsiTheme="minorBidi"/>
+          <w:sz w:val="20"/>
+          <w:szCs w:val="20"/>
+        </w:rPr>
+        <w:t>Approve the security warning.</w:t>
+      </w:r>
+    </w:p>
+    <w:p>
+      <w:pPr>
+        <w:pStyle w:val="a3"/>
+        <w:numPr>
+          <w:ilvl w:val="1"/>
+          <w:numId w:val="2"/>
+        </w:numPr>
+        <w:ind w:left="1276" w:hanging="567"/>
+        <w:rPr>
+          <w:rFonts w:asciiTheme="minorBidi" w:hAnsiTheme="minorBidi"/>
+          <w:sz w:val="20"/>
+          <w:szCs w:val="20"/>
+        </w:rPr>
+      </w:pPr>
+      <w:r>
+        <w:rPr>
+          <w:rFonts w:asciiTheme="minorBidi" w:hAnsiTheme="minorBidi"/>
+          <w:sz w:val="20"/>
+          <w:szCs w:val="20"/>
+        </w:rPr>
+        <w:t>After few seconds, a window will appear asking you where to save the repository.</w:t>
+      </w:r>
+    </w:p>
+    <w:p>
+      <w:pPr>
+        <w:pStyle w:val="a3"/>
+        <w:numPr>
+          <w:ilvl w:val="1"/>
+          <w:numId w:val="2"/>
+        </w:numPr>
+        <w:ind w:left="1276" w:hanging="567"/>
+        <w:rPr>
+          <w:rFonts w:asciiTheme="minorBidi" w:hAnsiTheme="minorBidi"/>
+          <w:sz w:val="20"/>
+          <w:szCs w:val="20"/>
+        </w:rPr>
+      </w:pPr>
+      <w:r>
+        <w:rPr>
+          <w:rFonts w:asciiTheme="minorBidi" w:hAnsiTheme="minorBidi"/>
+          <w:sz w:val="20"/>
+          <w:szCs w:val="20"/>
+        </w:rPr>
+        <w:t>Choose a folder</w:t>
+      </w:r>
+      <w:r>
+        <w:rPr>
+          <w:rFonts w:asciiTheme="minorBidi" w:hAnsiTheme="minorBidi"/>
+          <w:sz w:val="20"/>
+          <w:szCs w:val="20"/>
+        </w:rPr>
+        <w:t xml:space="preserve"> </w:t>
+      </w:r>
+      <w:r>
+        <w:rPr>
+          <w:rFonts w:asciiTheme="minorBidi" w:hAnsiTheme="minorBidi"/>
+          <w:sz w:val="20"/>
+          <w:szCs w:val="20"/>
+        </w:rPr>
+        <w:t>(</w:t>
+      </w:r>
+      <w:r>
+        <w:rPr>
+          <w:rFonts w:asciiTheme="minorBidi" w:hAnsiTheme="minorBidi"/>
+          <w:sz w:val="20"/>
+          <w:szCs w:val="20"/>
+          <w:u w:val="single"/>
+        </w:rPr>
+        <w:t>not too deep!!!</w:t>
+      </w:r>
+      <w:r>
+        <w:rPr>
+          <w:rFonts w:asciiTheme="minorBidi" w:hAnsiTheme="minorBidi"/>
+          <w:sz w:val="20"/>
+          <w:szCs w:val="20"/>
+        </w:rPr>
+        <w:t xml:space="preserve">) </w:t>
+      </w:r>
+      <w:r>
+        <w:rPr>
+          <w:rFonts w:asciiTheme="minorBidi" w:hAnsiTheme="minorBidi"/>
+          <w:sz w:val="20"/>
+          <w:szCs w:val="20"/>
+        </w:rPr>
+        <w:t>and after few seconds the repository will be cloned to your drive.</w:t>
+      </w:r>
+    </w:p>
+    <w:p>
+      <w:pPr>
+        <w:pStyle w:val="a3"/>
+        <w:numPr>
+          <w:ilvl w:val="1"/>
+          <w:numId w:val="2"/>
+        </w:numPr>
+        <w:ind w:left="1276" w:hanging="567"/>
+        <w:rPr>
+          <w:rFonts w:asciiTheme="minorBidi" w:hAnsiTheme="minorBidi"/>
+          <w:sz w:val="20"/>
+          <w:szCs w:val="20"/>
+        </w:rPr>
+      </w:pPr>
+      <w:r>
+        <w:rPr>
+          <w:rFonts w:asciiTheme="minorBidi" w:hAnsiTheme="minorBidi"/>
+          <w:sz w:val="20"/>
+          <w:szCs w:val="20"/>
+        </w:rPr>
+        <w:t xml:space="preserve">Wait for the </w:t>
+      </w:r>
+      <w:r>
+        <w:rPr>
+          <w:rFonts w:asciiTheme="minorBidi" w:hAnsiTheme="minorBidi"/>
+          <w:sz w:val="20"/>
+          <w:szCs w:val="20"/>
+        </w:rPr>
+        <w:t xml:space="preserve">repository </w:t>
+      </w:r>
+      <w:r>
+        <w:rPr>
+          <w:rFonts w:asciiTheme="minorBidi" w:hAnsiTheme="minorBidi"/>
+          <w:sz w:val="20"/>
+          <w:szCs w:val="20"/>
+        </w:rPr>
+        <w:t>download to finish.</w:t>
+      </w:r>
+    </w:p>
+    <w:p>
+      <w:pPr>
+        <w:pStyle w:val="a3"/>
+        <w:numPr>
+          <w:ilvl w:val="1"/>
+          <w:numId w:val="2"/>
+        </w:numPr>
+        <w:ind w:left="1276" w:hanging="567"/>
+        <w:rPr>
+          <w:rFonts w:asciiTheme="minorBidi" w:hAnsiTheme="minorBidi"/>
+          <w:sz w:val="20"/>
+          <w:szCs w:val="20"/>
+        </w:rPr>
+      </w:pPr>
+      <w:r>
+        <w:rPr>
+          <w:rFonts w:asciiTheme="minorBidi" w:hAnsiTheme="minorBidi" w:hint="cs"/>
+          <w:sz w:val="20"/>
+          <w:szCs w:val="20"/>
+        </w:rPr>
+        <w:t>R</w:t>
+      </w:r>
+      <w:r>
+        <w:rPr>
+          <w:rFonts w:asciiTheme="minorBidi" w:hAnsiTheme="minorBidi"/>
+          <w:sz w:val="20"/>
+          <w:szCs w:val="20"/>
+        </w:rPr>
+        <w:t>estart your computer.</w:t>
+      </w:r>
+    </w:p>
+    <w:p>
+      <w:pPr>
+        <w:pStyle w:val="a3"/>
+        <w:numPr>
+          <w:ilvl w:val="0"/>
+          <w:numId w:val="2"/>
+        </w:numPr>
+        <w:rPr>
+          <w:rFonts w:asciiTheme="minorBidi" w:hAnsiTheme="minorBidi"/>
+          <w:sz w:val="20"/>
+          <w:szCs w:val="20"/>
+        </w:rPr>
+      </w:pPr>
+      <w:r>
+        <w:rPr>
+          <w:rFonts w:asciiTheme="minorBidi" w:hAnsiTheme="minorBidi"/>
+          <w:sz w:val="20"/>
+          <w:szCs w:val="20"/>
+        </w:rPr>
+        <w:t xml:space="preserve">Run </w:t>
+      </w:r>
+      <w:r>
+        <w:rPr>
+          <w:rFonts w:asciiTheme="minorBidi" w:hAnsiTheme="minorBidi"/>
+          <w:b/>
+          <w:bCs/>
+          <w:sz w:val="20"/>
+          <w:szCs w:val="20"/>
+        </w:rPr>
+        <w:t>Visual Studio 2010</w:t>
+      </w:r>
+      <w:r>
+        <w:rPr>
+          <w:rFonts w:asciiTheme="minorBidi" w:hAnsiTheme="minorBidi"/>
+          <w:sz w:val="20"/>
+          <w:szCs w:val="20"/>
+        </w:rPr>
+        <w:t>.</w:t>
+      </w:r>
+    </w:p>
+    <w:p>
+      <w:pPr>
+        <w:pStyle w:val="a3"/>
+        <w:numPr>
+          <w:ilvl w:val="1"/>
+          <w:numId w:val="2"/>
+        </w:numPr>
+        <w:ind w:left="1276" w:hanging="567"/>
+        <w:rPr>
+          <w:rFonts w:asciiTheme="minorBidi" w:hAnsiTheme="minorBidi"/>
+          <w:sz w:val="20"/>
+          <w:szCs w:val="20"/>
+        </w:rPr>
+      </w:pPr>
+      <w:r>
+        <w:rPr>
+          <w:rFonts w:asciiTheme="minorBidi" w:hAnsiTheme="minorBidi" w:hint="cs"/>
+          <w:sz w:val="20"/>
+          <w:szCs w:val="20"/>
+        </w:rPr>
+        <w:t>C</w:t>
+      </w:r>
+      <w:r>
+        <w:rPr>
+          <w:rFonts w:asciiTheme="minorBidi" w:hAnsiTheme="minorBidi"/>
+          <w:sz w:val="20"/>
+          <w:szCs w:val="20"/>
+        </w:rPr>
+        <w:t xml:space="preserve">hoose your default environment settings: </w:t>
+      </w:r>
+      <w:r>
+        <w:rPr>
+          <w:rFonts w:asciiTheme="minorBidi" w:hAnsiTheme="minorBidi"/>
+          <w:b/>
+          <w:bCs/>
+          <w:sz w:val="20"/>
+          <w:szCs w:val="20"/>
+        </w:rPr>
+        <w:t>Visual C++ Development Settings</w:t>
+      </w:r>
+      <w:r>
+        <w:rPr>
+          <w:rFonts w:asciiTheme="minorBidi" w:hAnsiTheme="minorBidi"/>
+          <w:sz w:val="20"/>
+          <w:szCs w:val="20"/>
+        </w:rPr>
+        <w:t>.</w:t>
+      </w:r>
+    </w:p>
+    <w:p>
+      <w:pPr>
+        <w:pStyle w:val="a3"/>
+        <w:numPr>
+          <w:ilvl w:val="1"/>
+          <w:numId w:val="2"/>
+        </w:numPr>
+        <w:ind w:left="1276" w:hanging="567"/>
+        <w:rPr>
+          <w:rFonts w:asciiTheme="minorBidi" w:hAnsiTheme="minorBidi"/>
+          <w:sz w:val="20"/>
+          <w:szCs w:val="20"/>
+        </w:rPr>
+      </w:pPr>
+      <w:r>
+        <w:rPr>
+          <w:rFonts w:asciiTheme="minorBidi" w:hAnsiTheme="minorBidi"/>
+          <w:sz w:val="20"/>
+          <w:szCs w:val="20"/>
+        </w:rPr>
+        <w:t xml:space="preserve">Click </w:t>
+      </w:r>
+      <w:r>
+        <w:rPr>
+          <w:rFonts w:asciiTheme="minorBidi" w:hAnsiTheme="minorBidi"/>
+          <w:b/>
+          <w:bCs/>
+          <w:sz w:val="20"/>
+          <w:szCs w:val="20"/>
+        </w:rPr>
+        <w:t>Start Visual Studio</w:t>
+      </w:r>
+      <w:r>
+        <w:rPr>
+          <w:rFonts w:asciiTheme="minorBidi" w:hAnsiTheme="minorBidi"/>
+          <w:sz w:val="20"/>
+          <w:szCs w:val="20"/>
+        </w:rPr>
+        <w:t>.</w:t>
+      </w:r>
+    </w:p>
+    <w:p>
+      <w:pPr>
+        <w:pStyle w:val="a3"/>
+        <w:numPr>
+          <w:ilvl w:val="1"/>
+          <w:numId w:val="2"/>
+        </w:numPr>
+        <w:ind w:left="1276" w:hanging="567"/>
+        <w:rPr>
+          <w:rFonts w:asciiTheme="minorBidi" w:hAnsiTheme="minorBidi"/>
+          <w:sz w:val="20"/>
+          <w:szCs w:val="20"/>
+        </w:rPr>
+      </w:pPr>
+      <w:r>
+        <w:rPr>
+          <w:rFonts w:asciiTheme="minorBidi" w:hAnsiTheme="minorBidi"/>
+          <w:sz w:val="20"/>
+          <w:szCs w:val="20"/>
+        </w:rPr>
+        <w:t xml:space="preserve">Go to </w:t>
+      </w:r>
+      <w:r>
+        <w:rPr>
+          <w:rFonts w:asciiTheme="minorBidi" w:hAnsiTheme="minorBidi"/>
+          <w:b/>
+          <w:bCs/>
+          <w:sz w:val="20"/>
+          <w:szCs w:val="20"/>
+        </w:rPr>
+        <w:t>Tools</w:t>
+      </w:r>
+      <w:r>
+        <w:rPr>
+          <w:rFonts w:asciiTheme="minorBidi" w:hAnsiTheme="minorBidi" w:hint="cs"/>
+          <w:b/>
+          <w:bCs/>
+          <w:sz w:val="20"/>
+          <w:szCs w:val="20"/>
+        </w:rPr>
+        <w:t xml:space="preserve"> </w:t>
+      </w:r>
+      <w:r>
+        <w:rPr>
+          <w:rFonts w:asciiTheme="minorBidi" w:hAnsiTheme="minorBidi"/>
+          <w:b/>
+          <w:bCs/>
+          <w:sz w:val="20"/>
+          <w:szCs w:val="20"/>
+        </w:rPr>
+        <w:t>-</w:t>
+      </w:r>
+      <w:r>
+        <w:rPr>
+          <w:rFonts w:asciiTheme="minorBidi" w:hAnsiTheme="minorBidi" w:hint="cs"/>
+          <w:b/>
+          <w:bCs/>
+          <w:sz w:val="20"/>
+          <w:szCs w:val="20"/>
+        </w:rPr>
+        <w:t xml:space="preserve"> </w:t>
+      </w:r>
+      <w:r>
+        <w:rPr>
+          <w:rFonts w:asciiTheme="minorBidi" w:hAnsiTheme="minorBidi"/>
+          <w:b/>
+          <w:bCs/>
+          <w:sz w:val="20"/>
+          <w:szCs w:val="20"/>
+        </w:rPr>
+        <w:t>Options</w:t>
+      </w:r>
+      <w:r>
+        <w:rPr>
+          <w:rFonts w:asciiTheme="minorBidi" w:hAnsiTheme="minorBidi"/>
+          <w:sz w:val="20"/>
+          <w:szCs w:val="20"/>
+        </w:rPr>
+        <w:t>.</w:t>
+      </w:r>
+    </w:p>
+    <w:p>
+      <w:pPr>
+        <w:pStyle w:val="a3"/>
+        <w:numPr>
+          <w:ilvl w:val="1"/>
+          <w:numId w:val="2"/>
+        </w:numPr>
+        <w:ind w:left="1276" w:hanging="567"/>
+        <w:rPr>
+          <w:rFonts w:asciiTheme="minorBidi" w:hAnsiTheme="minorBidi"/>
+          <w:sz w:val="20"/>
+          <w:szCs w:val="20"/>
+        </w:rPr>
+      </w:pPr>
+      <w:r>
+        <w:rPr>
+          <w:rFonts w:asciiTheme="minorBidi" w:hAnsiTheme="minorBidi"/>
+          <w:sz w:val="20"/>
+          <w:szCs w:val="20"/>
+        </w:rPr>
+        <w:t>In the left pane</w:t>
+      </w:r>
+      <w:r>
+        <w:rPr>
+          <w:rFonts w:asciiTheme="minorBidi" w:hAnsiTheme="minorBidi"/>
+          <w:sz w:val="20"/>
+          <w:szCs w:val="20"/>
+        </w:rPr>
+        <w:t>, the</w:t>
+      </w:r>
+      <w:r>
+        <w:rPr>
+          <w:rFonts w:asciiTheme="minorBidi" w:hAnsiTheme="minorBidi"/>
+          <w:sz w:val="20"/>
+          <w:szCs w:val="20"/>
+        </w:rPr>
+        <w:t xml:space="preserve"> </w:t>
+      </w:r>
+      <w:r>
+        <w:rPr>
+          <w:rFonts w:asciiTheme="minorBidi" w:hAnsiTheme="minorBidi" w:hint="cs"/>
+          <w:b/>
+          <w:bCs/>
+          <w:sz w:val="20"/>
+          <w:szCs w:val="20"/>
+        </w:rPr>
+        <w:t>E</w:t>
+      </w:r>
+      <w:r>
+        <w:rPr>
+          <w:rFonts w:asciiTheme="minorBidi" w:hAnsiTheme="minorBidi"/>
+          <w:b/>
+          <w:bCs/>
+          <w:sz w:val="20"/>
+          <w:szCs w:val="20"/>
+        </w:rPr>
+        <w:t>nvironment</w:t>
+      </w:r>
+      <w:r>
+        <w:rPr>
+          <w:rFonts w:asciiTheme="minorBidi" w:hAnsiTheme="minorBidi"/>
+          <w:sz w:val="20"/>
+          <w:szCs w:val="20"/>
+        </w:rPr>
+        <w:t xml:space="preserve"> menu will </w:t>
+      </w:r>
+      <w:r>
+        <w:rPr>
+          <w:rFonts w:asciiTheme="minorBidi" w:hAnsiTheme="minorBidi"/>
+          <w:sz w:val="20"/>
+          <w:szCs w:val="20"/>
+        </w:rPr>
+        <w:t>a</w:t>
+      </w:r>
+      <w:r>
+        <w:rPr>
+          <w:rFonts w:asciiTheme="minorBidi" w:hAnsiTheme="minorBidi"/>
+          <w:sz w:val="20"/>
+          <w:szCs w:val="20"/>
+        </w:rPr>
+        <w:t xml:space="preserve">lready </w:t>
+      </w:r>
+      <w:r>
+        <w:rPr>
+          <w:rFonts w:asciiTheme="minorBidi" w:hAnsiTheme="minorBidi"/>
+          <w:sz w:val="20"/>
+          <w:szCs w:val="20"/>
+        </w:rPr>
+        <w:t xml:space="preserve">be </w:t>
+      </w:r>
+      <w:r>
+        <w:rPr>
+          <w:rFonts w:asciiTheme="minorBidi" w:hAnsiTheme="minorBidi"/>
+          <w:sz w:val="20"/>
+          <w:szCs w:val="20"/>
+        </w:rPr>
+        <w:t xml:space="preserve">open. Select </w:t>
+      </w:r>
+      <w:r>
+        <w:rPr>
+          <w:rFonts w:asciiTheme="minorBidi" w:hAnsiTheme="minorBidi"/>
+          <w:b/>
+          <w:bCs/>
+          <w:sz w:val="20"/>
+          <w:szCs w:val="20"/>
+        </w:rPr>
+        <w:t>Startup</w:t>
+      </w:r>
+      <w:r>
+        <w:rPr>
+          <w:rFonts w:asciiTheme="minorBidi" w:hAnsiTheme="minorBidi"/>
+          <w:sz w:val="20"/>
+          <w:szCs w:val="20"/>
+        </w:rPr>
+        <w:t>.</w:t>
+      </w:r>
+    </w:p>
+    <w:p>
+      <w:pPr>
+        <w:pStyle w:val="a3"/>
+        <w:numPr>
+          <w:ilvl w:val="1"/>
+          <w:numId w:val="2"/>
+        </w:numPr>
+        <w:ind w:left="1276" w:hanging="567"/>
+        <w:rPr>
+          <w:rFonts w:asciiTheme="minorBidi" w:hAnsiTheme="minorBidi"/>
+          <w:sz w:val="20"/>
+          <w:szCs w:val="20"/>
+        </w:rPr>
+      </w:pPr>
+      <w:r>
+        <w:rPr>
+          <w:rFonts w:asciiTheme="minorBidi" w:hAnsiTheme="minorBidi"/>
+          <w:sz w:val="20"/>
+          <w:szCs w:val="20"/>
+        </w:rPr>
+        <w:t xml:space="preserve">In the right pane, open the </w:t>
+      </w:r>
+      <w:r>
+        <w:rPr>
+          <w:rFonts w:asciiTheme="minorBidi" w:hAnsiTheme="minorBidi"/>
+          <w:sz w:val="20"/>
+          <w:szCs w:val="20"/>
+        </w:rPr>
+        <w:t xml:space="preserve">top </w:t>
+      </w:r>
+      <w:r>
+        <w:rPr>
+          <w:rFonts w:asciiTheme="minorBidi" w:hAnsiTheme="minorBidi"/>
+          <w:sz w:val="20"/>
+          <w:szCs w:val="20"/>
+        </w:rPr>
+        <w:t xml:space="preserve">pull down menu and select </w:t>
+      </w:r>
+      <w:r>
+        <w:rPr>
+          <w:rFonts w:asciiTheme="minorBidi" w:hAnsiTheme="minorBidi"/>
+          <w:b/>
+          <w:bCs/>
+          <w:sz w:val="20"/>
+          <w:szCs w:val="20"/>
+        </w:rPr>
+        <w:t>Load last loaded solution</w:t>
+      </w:r>
+      <w:r>
+        <w:rPr>
+          <w:rFonts w:asciiTheme="minorBidi" w:hAnsiTheme="minorBidi"/>
+          <w:sz w:val="20"/>
+          <w:szCs w:val="20"/>
+        </w:rPr>
+        <w:t>.</w:t>
+      </w:r>
+    </w:p>
+    <w:p>
+      <w:pPr>
+        <w:pStyle w:val="a3"/>
+        <w:numPr>
+          <w:ilvl w:val="1"/>
+          <w:numId w:val="2"/>
+        </w:numPr>
+        <w:ind w:left="1276" w:hanging="567"/>
+        <w:rPr>
+          <w:rFonts w:asciiTheme="minorBidi" w:hAnsiTheme="minorBidi"/>
+          <w:sz w:val="20"/>
+          <w:szCs w:val="20"/>
+        </w:rPr>
+      </w:pPr>
+      <w:r>
+        <w:rPr>
+          <w:rFonts w:asciiTheme="minorBidi" w:hAnsiTheme="minorBidi"/>
+          <w:sz w:val="20"/>
+          <w:szCs w:val="20"/>
+        </w:rPr>
+        <w:t xml:space="preserve">Click </w:t>
+      </w:r>
+      <w:r>
+        <w:rPr>
+          <w:rFonts w:asciiTheme="minorBidi" w:hAnsiTheme="minorBidi"/>
+          <w:b/>
+          <w:bCs/>
+          <w:sz w:val="20"/>
+          <w:szCs w:val="20"/>
+        </w:rPr>
+        <w:t>OK</w:t>
+      </w:r>
+      <w:r>
+        <w:rPr>
+          <w:rFonts w:asciiTheme="minorBidi" w:hAnsiTheme="minorBidi"/>
+          <w:sz w:val="20"/>
+          <w:szCs w:val="20"/>
+        </w:rPr>
+        <w:t>.</w:t>
+      </w:r>
+    </w:p>
+    <w:p>
+      <w:pPr>
+        <w:pStyle w:val="a3"/>
+        <w:numPr>
+          <w:ilvl w:val="0"/>
+          <w:numId w:val="2"/>
+        </w:numPr>
+        <w:rPr>
+          <w:rFonts w:asciiTheme="minorBidi" w:hAnsiTheme="minorBidi"/>
+          <w:sz w:val="20"/>
+          <w:szCs w:val="20"/>
+        </w:rPr>
+      </w:pPr>
+      <w:r>
+        <w:rPr>
+          <w:rFonts w:asciiTheme="minorBidi" w:hAnsiTheme="minorBidi"/>
+          <w:sz w:val="20"/>
+          <w:szCs w:val="20"/>
+        </w:rPr>
+        <w:t xml:space="preserve">Click </w:t>
+      </w:r>
+      <w:r>
+        <w:rPr>
+          <w:rFonts w:asciiTheme="minorBidi" w:hAnsiTheme="minorBidi"/>
+          <w:b/>
+          <w:bCs/>
+          <w:sz w:val="20"/>
+          <w:szCs w:val="20"/>
+        </w:rPr>
+        <w:t>File</w:t>
+      </w:r>
+      <w:r>
+        <w:rPr>
+          <w:rFonts w:asciiTheme="minorBidi" w:hAnsiTheme="minorBidi" w:hint="cs"/>
+          <w:b/>
+          <w:bCs/>
+          <w:sz w:val="20"/>
+          <w:szCs w:val="20"/>
+        </w:rPr>
+        <w:t xml:space="preserve"> </w:t>
+      </w:r>
+      <w:r>
+        <w:rPr>
+          <w:rFonts w:asciiTheme="minorBidi" w:hAnsiTheme="minorBidi"/>
+          <w:b/>
+          <w:bCs/>
+          <w:sz w:val="20"/>
+          <w:szCs w:val="20"/>
+        </w:rPr>
+        <w:t>–</w:t>
+      </w:r>
+      <w:r>
+        <w:rPr>
+          <w:rFonts w:asciiTheme="minorBidi" w:hAnsiTheme="minorBidi" w:hint="cs"/>
+          <w:b/>
+          <w:bCs/>
+          <w:sz w:val="20"/>
+          <w:szCs w:val="20"/>
+        </w:rPr>
+        <w:t xml:space="preserve"> </w:t>
+      </w:r>
+      <w:r>
+        <w:rPr>
+          <w:rFonts w:asciiTheme="minorBidi" w:hAnsiTheme="minorBidi"/>
+          <w:b/>
+          <w:bCs/>
+          <w:sz w:val="20"/>
+          <w:szCs w:val="20"/>
+        </w:rPr>
+        <w:t>Open</w:t>
+      </w:r>
+      <w:r>
+        <w:rPr>
+          <w:rFonts w:asciiTheme="minorBidi" w:hAnsiTheme="minorBidi" w:hint="cs"/>
+          <w:b/>
+          <w:bCs/>
+          <w:sz w:val="20"/>
+          <w:szCs w:val="20"/>
+        </w:rPr>
+        <w:t xml:space="preserve"> </w:t>
+      </w:r>
+      <w:r>
+        <w:rPr>
+          <w:rFonts w:asciiTheme="minorBidi" w:hAnsiTheme="minorBidi"/>
+          <w:b/>
+          <w:bCs/>
+          <w:sz w:val="20"/>
+          <w:szCs w:val="20"/>
+        </w:rPr>
+        <w:t>-</w:t>
+      </w:r>
+      <w:r>
+        <w:rPr>
+          <w:rFonts w:asciiTheme="minorBidi" w:hAnsiTheme="minorBidi" w:hint="cs"/>
+          <w:b/>
+          <w:bCs/>
+          <w:sz w:val="20"/>
+          <w:szCs w:val="20"/>
+        </w:rPr>
+        <w:t xml:space="preserve"> </w:t>
+      </w:r>
+      <w:r>
+        <w:rPr>
+          <w:rFonts w:asciiTheme="minorBidi" w:hAnsiTheme="minorBidi"/>
+          <w:b/>
+          <w:bCs/>
+          <w:sz w:val="20"/>
+          <w:szCs w:val="20"/>
+        </w:rPr>
+        <w:t>Project/Solution</w:t>
+      </w:r>
+      <w:r>
+        <w:rPr>
+          <w:rFonts w:asciiTheme="minorBidi" w:hAnsiTheme="minorBidi"/>
+          <w:sz w:val="20"/>
+          <w:szCs w:val="20"/>
+        </w:rPr>
+        <w:t>.</w:t>
+      </w:r>
+    </w:p>
+    <w:p>
+      <w:pPr>
+        <w:pStyle w:val="a3"/>
+        <w:numPr>
+          <w:ilvl w:val="1"/>
+          <w:numId w:val="2"/>
+        </w:numPr>
+        <w:ind w:left="1276" w:hanging="567"/>
+        <w:rPr>
+          <w:rFonts w:asciiTheme="minorBidi" w:hAnsiTheme="minorBidi"/>
+          <w:sz w:val="20"/>
+          <w:szCs w:val="20"/>
+        </w:rPr>
+      </w:pPr>
+      <w:r>
+        <w:rPr>
+          <w:rFonts w:asciiTheme="minorBidi" w:hAnsiTheme="minorBidi"/>
+          <w:sz w:val="20"/>
+          <w:szCs w:val="20"/>
+        </w:rPr>
+        <w:t>Browse to your repository.</w:t>
+      </w:r>
+    </w:p>
+    <w:p>
+      <w:pPr>
+        <w:pStyle w:val="a3"/>
+        <w:numPr>
+          <w:ilvl w:val="1"/>
+          <w:numId w:val="2"/>
+        </w:numPr>
+        <w:ind w:left="1276" w:hanging="567"/>
+        <w:rPr>
+          <w:rFonts w:asciiTheme="minorBidi" w:hAnsiTheme="minorBidi"/>
+          <w:sz w:val="20"/>
+          <w:szCs w:val="20"/>
+        </w:rPr>
+      </w:pPr>
+      <w:r>
+        <w:rPr>
+          <w:rFonts w:asciiTheme="minorBidi" w:hAnsiTheme="minorBidi"/>
+          <w:sz w:val="20"/>
+          <w:szCs w:val="20"/>
+        </w:rPr>
+        <w:t xml:space="preserve">Browse to </w:t>
+      </w:r>
+      <w:proofErr w:type="spellStart"/>
+      <w:r>
+        <w:rPr>
+          <w:rFonts w:asciiTheme="minorBidi" w:hAnsiTheme="minorBidi"/>
+          <w:b/>
+          <w:bCs/>
+          <w:sz w:val="20"/>
+          <w:szCs w:val="20"/>
+        </w:rPr>
+        <w:t>freefalcon</w:t>
+      </w:r>
+      <w:proofErr w:type="spellEnd"/>
+      <w:r>
+        <w:rPr>
+          <w:rFonts w:asciiTheme="minorBidi" w:hAnsiTheme="minorBidi"/>
+          <w:b/>
+          <w:bCs/>
+          <w:sz w:val="20"/>
+          <w:szCs w:val="20"/>
+        </w:rPr>
+        <w:t>-central</w:t>
+      </w:r>
+      <w:r>
+        <w:rPr>
+          <w:rFonts w:asciiTheme="minorBidi" w:hAnsiTheme="minorBidi"/>
+          <w:b/>
+          <w:bCs/>
+          <w:sz w:val="20"/>
+          <w:szCs w:val="20"/>
+        </w:rPr>
+        <w:t>\</w:t>
+      </w:r>
+      <w:proofErr w:type="spellStart"/>
+      <w:r>
+        <w:rPr>
+          <w:rFonts w:asciiTheme="minorBidi" w:hAnsiTheme="minorBidi"/>
+          <w:b/>
+          <w:bCs/>
+          <w:sz w:val="20"/>
+          <w:szCs w:val="20"/>
+        </w:rPr>
+        <w:t>src</w:t>
+      </w:r>
+      <w:proofErr w:type="spellEnd"/>
+      <w:r>
+        <w:rPr>
+          <w:rFonts w:asciiTheme="minorBidi" w:hAnsiTheme="minorBidi"/>
+          <w:b/>
+          <w:bCs/>
+          <w:sz w:val="20"/>
+          <w:szCs w:val="20"/>
+        </w:rPr>
+        <w:t>\</w:t>
+      </w:r>
       <w:bookmarkStart w:id="0" w:name="_GoBack"/>
-      <w:r>
-        <w:rPr>
-          <w:rFonts w:asciiTheme="minorBidi" w:hAnsiTheme="minorBidi"/>
-          <w:b/>
-          <w:bCs/>
-          <w:sz w:val="20"/>
-          <w:szCs w:val="20"/>
-        </w:rPr>
-        <w:t>URL</w:t>
-      </w:r>
       <w:bookmarkEnd w:id="0"/>
       <w:r>
         <w:rPr>
           <w:rFonts w:asciiTheme="minorBidi" w:hAnsiTheme="minorBidi"/>
-          <w:sz w:val="20"/>
-          <w:szCs w:val="20"/>
-        </w:rPr>
-        <w:t xml:space="preserve"> in your browser’s bookmarks.</w:t>
-      </w:r>
-    </w:p>
-    <w:p>
-      <w:pPr>
-        <w:pStyle w:val="a3"/>
-        <w:numPr>
-          <w:ilvl w:val="1"/>
-          <w:numId w:val="2"/>
-        </w:numPr>
-        <w:ind w:left="1276" w:hanging="567"/>
-        <w:rPr>
-          <w:rFonts w:asciiTheme="minorBidi" w:hAnsiTheme="minorBidi"/>
-          <w:sz w:val="20"/>
-          <w:szCs w:val="20"/>
-        </w:rPr>
-      </w:pPr>
-      <w:r>
-        <w:rPr>
-          <w:rFonts w:asciiTheme="minorBidi" w:hAnsiTheme="minorBidi"/>
-          <w:sz w:val="20"/>
-          <w:szCs w:val="20"/>
-        </w:rPr>
-        <w:t xml:space="preserve">Click the </w:t>
-      </w:r>
-      <w:r>
-        <w:rPr>
-          <w:rFonts w:asciiTheme="minorBidi" w:hAnsiTheme="minorBidi"/>
-          <w:b/>
-          <w:bCs/>
-          <w:sz w:val="20"/>
-          <w:szCs w:val="20"/>
-        </w:rPr>
-        <w:t>Clone in Desktop</w:t>
-      </w:r>
-      <w:r>
-        <w:rPr>
-          <w:rFonts w:asciiTheme="minorBidi" w:hAnsiTheme="minorBidi"/>
-          <w:sz w:val="20"/>
-          <w:szCs w:val="20"/>
-        </w:rPr>
-        <w:t xml:space="preserve"> icon</w:t>
-      </w:r>
-      <w:r>
-        <w:rPr>
-          <w:rFonts w:asciiTheme="minorBidi" w:hAnsiTheme="minorBidi"/>
-          <w:sz w:val="20"/>
-          <w:szCs w:val="20"/>
-        </w:rPr>
-        <w:t xml:space="preserve"> at the lower right of the screen.</w:t>
-      </w:r>
-    </w:p>
-    <w:p>
-      <w:pPr>
-        <w:pStyle w:val="a3"/>
-        <w:numPr>
-          <w:ilvl w:val="1"/>
-          <w:numId w:val="2"/>
-        </w:numPr>
-        <w:ind w:left="1276" w:hanging="567"/>
-        <w:rPr>
-          <w:rFonts w:asciiTheme="minorBidi" w:hAnsiTheme="minorBidi"/>
-          <w:sz w:val="20"/>
-          <w:szCs w:val="20"/>
-        </w:rPr>
-      </w:pPr>
-      <w:r>
-        <w:rPr>
-          <w:rFonts w:asciiTheme="minorBidi" w:hAnsiTheme="minorBidi"/>
-          <w:sz w:val="20"/>
-          <w:szCs w:val="20"/>
-        </w:rPr>
-        <w:t>Approve the security warning.</w:t>
-      </w:r>
-    </w:p>
-    <w:p>
-      <w:pPr>
-        <w:pStyle w:val="a3"/>
-        <w:numPr>
-          <w:ilvl w:val="1"/>
-          <w:numId w:val="2"/>
-        </w:numPr>
-        <w:ind w:left="1276" w:hanging="567"/>
-        <w:rPr>
-          <w:rFonts w:asciiTheme="minorBidi" w:hAnsiTheme="minorBidi"/>
-          <w:sz w:val="20"/>
-          <w:szCs w:val="20"/>
-        </w:rPr>
-      </w:pPr>
-      <w:r>
-        <w:rPr>
-          <w:rFonts w:asciiTheme="minorBidi" w:hAnsiTheme="minorBidi"/>
-          <w:sz w:val="20"/>
-          <w:szCs w:val="20"/>
-        </w:rPr>
-        <w:t>After few seconds, a window will appear asking you where to save the repository.</w:t>
-      </w:r>
-    </w:p>
-    <w:p>
-      <w:pPr>
-        <w:pStyle w:val="a3"/>
-        <w:numPr>
-          <w:ilvl w:val="1"/>
-          <w:numId w:val="2"/>
-        </w:numPr>
-        <w:ind w:left="1276" w:hanging="567"/>
-        <w:rPr>
-          <w:rFonts w:asciiTheme="minorBidi" w:hAnsiTheme="minorBidi"/>
-          <w:sz w:val="20"/>
-          <w:szCs w:val="20"/>
-        </w:rPr>
-      </w:pPr>
-      <w:r>
-        <w:rPr>
-          <w:rFonts w:asciiTheme="minorBidi" w:hAnsiTheme="minorBidi"/>
-          <w:sz w:val="20"/>
-          <w:szCs w:val="20"/>
-        </w:rPr>
-        <w:t>Choose a folder</w:t>
-      </w:r>
-      <w:r>
-        <w:rPr>
-          <w:rFonts w:asciiTheme="minorBidi" w:hAnsiTheme="minorBidi"/>
-          <w:sz w:val="20"/>
-          <w:szCs w:val="20"/>
-        </w:rPr>
-        <w:t xml:space="preserve"> </w:t>
-      </w:r>
-      <w:r>
-        <w:rPr>
-          <w:rFonts w:asciiTheme="minorBidi" w:hAnsiTheme="minorBidi"/>
-          <w:sz w:val="20"/>
-          <w:szCs w:val="20"/>
-        </w:rPr>
-        <w:t>(</w:t>
-      </w:r>
-      <w:r>
-        <w:rPr>
-          <w:rFonts w:asciiTheme="minorBidi" w:hAnsiTheme="minorBidi"/>
-          <w:sz w:val="20"/>
-          <w:szCs w:val="20"/>
-          <w:u w:val="single"/>
-        </w:rPr>
-        <w:t>not too deep!!!</w:t>
-      </w:r>
-      <w:r>
-        <w:rPr>
-          <w:rFonts w:asciiTheme="minorBidi" w:hAnsiTheme="minorBidi"/>
-          <w:sz w:val="20"/>
-          <w:szCs w:val="20"/>
-        </w:rPr>
-        <w:t xml:space="preserve">) </w:t>
-      </w:r>
-      <w:r>
-        <w:rPr>
-          <w:rFonts w:asciiTheme="minorBidi" w:hAnsiTheme="minorBidi"/>
-          <w:sz w:val="20"/>
-          <w:szCs w:val="20"/>
-        </w:rPr>
-        <w:t>and after few seconds the repository will be cloned to your drive.</w:t>
-      </w:r>
-    </w:p>
-    <w:p>
-      <w:pPr>
-        <w:pStyle w:val="a3"/>
-        <w:numPr>
-          <w:ilvl w:val="1"/>
-          <w:numId w:val="2"/>
-        </w:numPr>
-        <w:ind w:left="1276" w:hanging="567"/>
-        <w:rPr>
-          <w:rFonts w:asciiTheme="minorBidi" w:hAnsiTheme="minorBidi"/>
-          <w:sz w:val="20"/>
-          <w:szCs w:val="20"/>
-        </w:rPr>
-      </w:pPr>
-      <w:r>
-        <w:rPr>
-          <w:rFonts w:asciiTheme="minorBidi" w:hAnsiTheme="minorBidi"/>
-          <w:sz w:val="20"/>
-          <w:szCs w:val="20"/>
-        </w:rPr>
-        <w:t xml:space="preserve">Wait for the </w:t>
-      </w:r>
-      <w:r>
-        <w:rPr>
-          <w:rFonts w:asciiTheme="minorBidi" w:hAnsiTheme="minorBidi"/>
-          <w:sz w:val="20"/>
-          <w:szCs w:val="20"/>
-        </w:rPr>
-        <w:t xml:space="preserve">repository </w:t>
-      </w:r>
-      <w:r>
-        <w:rPr>
-          <w:rFonts w:asciiTheme="minorBidi" w:hAnsiTheme="minorBidi"/>
-          <w:sz w:val="20"/>
-          <w:szCs w:val="20"/>
-        </w:rPr>
-        <w:t>download to finish.</w:t>
-      </w:r>
-    </w:p>
-    <w:p>
-      <w:pPr>
-        <w:pStyle w:val="a3"/>
-        <w:numPr>
-          <w:ilvl w:val="1"/>
-          <w:numId w:val="2"/>
-        </w:numPr>
-        <w:ind w:left="1276" w:hanging="567"/>
-        <w:rPr>
-          <w:rFonts w:asciiTheme="minorBidi" w:hAnsiTheme="minorBidi"/>
-          <w:sz w:val="20"/>
-          <w:szCs w:val="20"/>
-        </w:rPr>
-      </w:pPr>
-      <w:r>
-        <w:rPr>
-          <w:rFonts w:asciiTheme="minorBidi" w:hAnsiTheme="minorBidi" w:hint="cs"/>
-          <w:sz w:val="20"/>
-          <w:szCs w:val="20"/>
-        </w:rPr>
-        <w:t>R</w:t>
-      </w:r>
-      <w:r>
-        <w:rPr>
-          <w:rFonts w:asciiTheme="minorBidi" w:hAnsiTheme="minorBidi"/>
-          <w:sz w:val="20"/>
-          <w:szCs w:val="20"/>
-        </w:rPr>
-        <w:t>estart your computer.</w:t>
-      </w:r>
-    </w:p>
-    <w:p>
-      <w:pPr>
-        <w:pStyle w:val="a3"/>
-        <w:numPr>
-          <w:ilvl w:val="0"/>
-          <w:numId w:val="2"/>
-        </w:numPr>
-        <w:rPr>
-          <w:rFonts w:asciiTheme="minorBidi" w:hAnsiTheme="minorBidi"/>
-          <w:sz w:val="20"/>
-          <w:szCs w:val="20"/>
-        </w:rPr>
-      </w:pPr>
-      <w:r>
-        <w:rPr>
-          <w:rFonts w:asciiTheme="minorBidi" w:hAnsiTheme="minorBidi"/>
-          <w:sz w:val="20"/>
-          <w:szCs w:val="20"/>
-        </w:rPr>
-        <w:t xml:space="preserve">Run </w:t>
-      </w:r>
-      <w:r>
-        <w:rPr>
-          <w:rFonts w:asciiTheme="minorBidi" w:hAnsiTheme="minorBidi"/>
-          <w:b/>
-          <w:bCs/>
-          <w:sz w:val="20"/>
-          <w:szCs w:val="20"/>
-        </w:rPr>
-        <w:t>Visual Studio 2010</w:t>
-      </w:r>
-      <w:r>
-        <w:rPr>
-          <w:rFonts w:asciiTheme="minorBidi" w:hAnsiTheme="minorBidi"/>
-          <w:sz w:val="20"/>
-          <w:szCs w:val="20"/>
-        </w:rPr>
-        <w:t>.</w:t>
-      </w:r>
-    </w:p>
-    <w:p>
-      <w:pPr>
-        <w:pStyle w:val="a3"/>
-        <w:numPr>
-          <w:ilvl w:val="1"/>
-          <w:numId w:val="2"/>
-        </w:numPr>
-        <w:ind w:left="1276" w:hanging="567"/>
-        <w:rPr>
-          <w:rFonts w:asciiTheme="minorBidi" w:hAnsiTheme="minorBidi"/>
-          <w:sz w:val="20"/>
-          <w:szCs w:val="20"/>
-        </w:rPr>
-      </w:pPr>
-      <w:r>
-        <w:rPr>
-          <w:rFonts w:asciiTheme="minorBidi" w:hAnsiTheme="minorBidi" w:hint="cs"/>
-          <w:sz w:val="20"/>
-          <w:szCs w:val="20"/>
-        </w:rPr>
-        <w:t>C</w:t>
-      </w:r>
-      <w:r>
-        <w:rPr>
-          <w:rFonts w:asciiTheme="minorBidi" w:hAnsiTheme="minorBidi"/>
-          <w:sz w:val="20"/>
-          <w:szCs w:val="20"/>
-        </w:rPr>
-        <w:t xml:space="preserve">hoose your default environment settings: </w:t>
-      </w:r>
-      <w:r>
-        <w:rPr>
-          <w:rFonts w:asciiTheme="minorBidi" w:hAnsiTheme="minorBidi"/>
-          <w:b/>
-          <w:bCs/>
-          <w:sz w:val="20"/>
-          <w:szCs w:val="20"/>
-        </w:rPr>
-        <w:t>Visual C++ Development Settings</w:t>
-      </w:r>
-      <w:r>
-        <w:rPr>
-          <w:rFonts w:asciiTheme="minorBidi" w:hAnsiTheme="minorBidi"/>
-          <w:sz w:val="20"/>
-          <w:szCs w:val="20"/>
-        </w:rPr>
-        <w:t>.</w:t>
-      </w:r>
-    </w:p>
-    <w:p>
-      <w:pPr>
-        <w:pStyle w:val="a3"/>
-        <w:numPr>
-          <w:ilvl w:val="1"/>
-          <w:numId w:val="2"/>
-        </w:numPr>
-        <w:ind w:left="1276" w:hanging="567"/>
-        <w:rPr>
-          <w:rFonts w:asciiTheme="minorBidi" w:hAnsiTheme="minorBidi"/>
-          <w:sz w:val="20"/>
-          <w:szCs w:val="20"/>
-        </w:rPr>
-      </w:pPr>
-      <w:r>
-        <w:rPr>
-          <w:rFonts w:asciiTheme="minorBidi" w:hAnsiTheme="minorBidi"/>
-          <w:sz w:val="20"/>
-          <w:szCs w:val="20"/>
-        </w:rPr>
-        <w:t xml:space="preserve">Click </w:t>
-      </w:r>
-      <w:r>
-        <w:rPr>
-          <w:rFonts w:asciiTheme="minorBidi" w:hAnsiTheme="minorBidi"/>
-          <w:b/>
-          <w:bCs/>
-          <w:sz w:val="20"/>
-          <w:szCs w:val="20"/>
-        </w:rPr>
-        <w:t>Start Visual Studio</w:t>
-      </w:r>
-      <w:r>
-        <w:rPr>
-          <w:rFonts w:asciiTheme="minorBidi" w:hAnsiTheme="minorBidi"/>
-          <w:sz w:val="20"/>
-          <w:szCs w:val="20"/>
-        </w:rPr>
-        <w:t>.</w:t>
-      </w:r>
-    </w:p>
-    <w:p>
-      <w:pPr>
-        <w:pStyle w:val="a3"/>
-        <w:numPr>
-          <w:ilvl w:val="1"/>
-          <w:numId w:val="2"/>
-        </w:numPr>
-        <w:ind w:left="1276" w:hanging="567"/>
-        <w:rPr>
-          <w:rFonts w:asciiTheme="minorBidi" w:hAnsiTheme="minorBidi"/>
-          <w:sz w:val="20"/>
-          <w:szCs w:val="20"/>
-        </w:rPr>
-      </w:pPr>
-      <w:r>
-        <w:rPr>
-          <w:rFonts w:asciiTheme="minorBidi" w:hAnsiTheme="minorBidi"/>
-          <w:sz w:val="20"/>
-          <w:szCs w:val="20"/>
-        </w:rPr>
-        <w:t xml:space="preserve">Go to </w:t>
-      </w:r>
-      <w:r>
-        <w:rPr>
-          <w:rFonts w:asciiTheme="minorBidi" w:hAnsiTheme="minorBidi"/>
-          <w:b/>
-          <w:bCs/>
-          <w:sz w:val="20"/>
-          <w:szCs w:val="20"/>
-        </w:rPr>
-        <w:t>Tools</w:t>
-      </w:r>
-      <w:r>
-        <w:rPr>
-          <w:rFonts w:asciiTheme="minorBidi" w:hAnsiTheme="minorBidi" w:hint="cs"/>
-          <w:b/>
-          <w:bCs/>
-          <w:sz w:val="20"/>
-          <w:szCs w:val="20"/>
-        </w:rPr>
-        <w:t xml:space="preserve"> </w:t>
-      </w:r>
-      <w:r>
-        <w:rPr>
-          <w:rFonts w:asciiTheme="minorBidi" w:hAnsiTheme="minorBidi"/>
-          <w:b/>
-          <w:bCs/>
-          <w:sz w:val="20"/>
-          <w:szCs w:val="20"/>
-        </w:rPr>
-        <w:t>-</w:t>
-      </w:r>
-      <w:r>
-        <w:rPr>
-          <w:rFonts w:asciiTheme="minorBidi" w:hAnsiTheme="minorBidi" w:hint="cs"/>
-          <w:b/>
-          <w:bCs/>
-          <w:sz w:val="20"/>
-          <w:szCs w:val="20"/>
-        </w:rPr>
-        <w:t xml:space="preserve"> </w:t>
-      </w:r>
-      <w:r>
-        <w:rPr>
-          <w:rFonts w:asciiTheme="minorBidi" w:hAnsiTheme="minorBidi"/>
-          <w:b/>
-          <w:bCs/>
-          <w:sz w:val="20"/>
-          <w:szCs w:val="20"/>
-        </w:rPr>
-        <w:t>Options</w:t>
-      </w:r>
-      <w:r>
-        <w:rPr>
-          <w:rFonts w:asciiTheme="minorBidi" w:hAnsiTheme="minorBidi"/>
-          <w:sz w:val="20"/>
-          <w:szCs w:val="20"/>
-        </w:rPr>
-        <w:t>.</w:t>
-      </w:r>
-    </w:p>
-    <w:p>
-      <w:pPr>
-        <w:pStyle w:val="a3"/>
-        <w:numPr>
-          <w:ilvl w:val="1"/>
-          <w:numId w:val="2"/>
-        </w:numPr>
-        <w:ind w:left="1276" w:hanging="567"/>
-        <w:rPr>
-          <w:rFonts w:asciiTheme="minorBidi" w:hAnsiTheme="minorBidi"/>
-          <w:sz w:val="20"/>
-          <w:szCs w:val="20"/>
-        </w:rPr>
-      </w:pPr>
-      <w:r>
-        <w:rPr>
-          <w:rFonts w:asciiTheme="minorBidi" w:hAnsiTheme="minorBidi"/>
-          <w:sz w:val="20"/>
-          <w:szCs w:val="20"/>
-        </w:rPr>
-        <w:t>In the left pane</w:t>
-      </w:r>
-      <w:r>
-        <w:rPr>
-          <w:rFonts w:asciiTheme="minorBidi" w:hAnsiTheme="minorBidi"/>
-          <w:sz w:val="20"/>
-          <w:szCs w:val="20"/>
-        </w:rPr>
-        <w:t>, the</w:t>
-      </w:r>
-      <w:r>
-        <w:rPr>
-          <w:rFonts w:asciiTheme="minorBidi" w:hAnsiTheme="minorBidi"/>
-          <w:sz w:val="20"/>
-          <w:szCs w:val="20"/>
-        </w:rPr>
-        <w:t xml:space="preserve"> </w:t>
-      </w:r>
-      <w:r>
-        <w:rPr>
-          <w:rFonts w:asciiTheme="minorBidi" w:hAnsiTheme="minorBidi" w:hint="cs"/>
-          <w:b/>
-          <w:bCs/>
-          <w:sz w:val="20"/>
-          <w:szCs w:val="20"/>
-        </w:rPr>
-        <w:t>E</w:t>
-      </w:r>
-      <w:r>
-        <w:rPr>
-          <w:rFonts w:asciiTheme="minorBidi" w:hAnsiTheme="minorBidi"/>
-          <w:b/>
-          <w:bCs/>
-          <w:sz w:val="20"/>
-          <w:szCs w:val="20"/>
-        </w:rPr>
-        <w:t>nvironment</w:t>
-      </w:r>
-      <w:r>
-        <w:rPr>
-          <w:rFonts w:asciiTheme="minorBidi" w:hAnsiTheme="minorBidi"/>
-          <w:sz w:val="20"/>
-          <w:szCs w:val="20"/>
-        </w:rPr>
-        <w:t xml:space="preserve"> menu will </w:t>
-      </w:r>
-      <w:r>
-        <w:rPr>
-          <w:rFonts w:asciiTheme="minorBidi" w:hAnsiTheme="minorBidi"/>
-          <w:sz w:val="20"/>
-          <w:szCs w:val="20"/>
-        </w:rPr>
-        <w:t>a</w:t>
-      </w:r>
-      <w:r>
-        <w:rPr>
-          <w:rFonts w:asciiTheme="minorBidi" w:hAnsiTheme="minorBidi"/>
-          <w:sz w:val="20"/>
-          <w:szCs w:val="20"/>
-        </w:rPr>
-        <w:t xml:space="preserve">lready </w:t>
-      </w:r>
-      <w:r>
-        <w:rPr>
-          <w:rFonts w:asciiTheme="minorBidi" w:hAnsiTheme="minorBidi"/>
-          <w:sz w:val="20"/>
-          <w:szCs w:val="20"/>
-        </w:rPr>
-        <w:t xml:space="preserve">be </w:t>
-      </w:r>
-      <w:r>
-        <w:rPr>
-          <w:rFonts w:asciiTheme="minorBidi" w:hAnsiTheme="minorBidi"/>
-          <w:sz w:val="20"/>
-          <w:szCs w:val="20"/>
-        </w:rPr>
-        <w:t xml:space="preserve">open. Select </w:t>
-      </w:r>
-      <w:r>
-        <w:rPr>
-          <w:rFonts w:asciiTheme="minorBidi" w:hAnsiTheme="minorBidi"/>
-          <w:b/>
-          <w:bCs/>
-          <w:sz w:val="20"/>
-          <w:szCs w:val="20"/>
-        </w:rPr>
-        <w:t>Startup</w:t>
-      </w:r>
-      <w:r>
-        <w:rPr>
-          <w:rFonts w:asciiTheme="minorBidi" w:hAnsiTheme="minorBidi"/>
-          <w:sz w:val="20"/>
-          <w:szCs w:val="20"/>
-        </w:rPr>
-        <w:t>.</w:t>
-      </w:r>
-    </w:p>
-    <w:p>
-      <w:pPr>
-        <w:pStyle w:val="a3"/>
-        <w:numPr>
-          <w:ilvl w:val="1"/>
-          <w:numId w:val="2"/>
-        </w:numPr>
-        <w:ind w:left="1276" w:hanging="567"/>
-        <w:rPr>
-          <w:rFonts w:asciiTheme="minorBidi" w:hAnsiTheme="minorBidi"/>
-          <w:sz w:val="20"/>
-          <w:szCs w:val="20"/>
-        </w:rPr>
-      </w:pPr>
-      <w:r>
-        <w:rPr>
-          <w:rFonts w:asciiTheme="minorBidi" w:hAnsiTheme="minorBidi"/>
-          <w:sz w:val="20"/>
-          <w:szCs w:val="20"/>
-        </w:rPr>
-        <w:t xml:space="preserve">In the right pane, open the </w:t>
-      </w:r>
-      <w:r>
-        <w:rPr>
-          <w:rFonts w:asciiTheme="minorBidi" w:hAnsiTheme="minorBidi"/>
-          <w:sz w:val="20"/>
-          <w:szCs w:val="20"/>
-        </w:rPr>
-        <w:t xml:space="preserve">top </w:t>
-      </w:r>
-      <w:r>
-        <w:rPr>
-          <w:rFonts w:asciiTheme="minorBidi" w:hAnsiTheme="minorBidi"/>
-          <w:sz w:val="20"/>
-          <w:szCs w:val="20"/>
-        </w:rPr>
-        <w:t xml:space="preserve">pull down menu and select </w:t>
-      </w:r>
-      <w:r>
-        <w:rPr>
-          <w:rFonts w:asciiTheme="minorBidi" w:hAnsiTheme="minorBidi"/>
-          <w:b/>
-          <w:bCs/>
-          <w:sz w:val="20"/>
-          <w:szCs w:val="20"/>
-        </w:rPr>
-        <w:t>Load last loaded solution</w:t>
-      </w:r>
-      <w:r>
-        <w:rPr>
-          <w:rFonts w:asciiTheme="minorBidi" w:hAnsiTheme="minorBidi"/>
-          <w:sz w:val="20"/>
-          <w:szCs w:val="20"/>
-        </w:rPr>
-        <w:t>.</w:t>
-      </w:r>
-    </w:p>
-    <w:p>
-      <w:pPr>
-        <w:pStyle w:val="a3"/>
-        <w:numPr>
-          <w:ilvl w:val="1"/>
-          <w:numId w:val="2"/>
-        </w:numPr>
-        <w:ind w:left="1276" w:hanging="567"/>
-        <w:rPr>
-          <w:rFonts w:asciiTheme="minorBidi" w:hAnsiTheme="minorBidi"/>
-          <w:sz w:val="20"/>
-          <w:szCs w:val="20"/>
-        </w:rPr>
-      </w:pPr>
-      <w:r>
-        <w:rPr>
-          <w:rFonts w:asciiTheme="minorBidi" w:hAnsiTheme="minorBidi"/>
-          <w:sz w:val="20"/>
-          <w:szCs w:val="20"/>
-        </w:rPr>
-        <w:t xml:space="preserve">Click </w:t>
-      </w:r>
-      <w:r>
-        <w:rPr>
-          <w:rFonts w:asciiTheme="minorBidi" w:hAnsiTheme="minorBidi"/>
-          <w:b/>
-          <w:bCs/>
-          <w:sz w:val="20"/>
-          <w:szCs w:val="20"/>
-        </w:rPr>
-        <w:t>OK</w:t>
-      </w:r>
-      <w:r>
-        <w:rPr>
-          <w:rFonts w:asciiTheme="minorBidi" w:hAnsiTheme="minorBidi"/>
-          <w:sz w:val="20"/>
-          <w:szCs w:val="20"/>
-        </w:rPr>
-        <w:t>.</w:t>
-      </w:r>
-    </w:p>
-    <w:p>
-      <w:pPr>
-        <w:pStyle w:val="a3"/>
-        <w:numPr>
-          <w:ilvl w:val="0"/>
-          <w:numId w:val="2"/>
-        </w:numPr>
-        <w:rPr>
-          <w:rFonts w:asciiTheme="minorBidi" w:hAnsiTheme="minorBidi"/>
-          <w:sz w:val="20"/>
-          <w:szCs w:val="20"/>
-        </w:rPr>
-      </w:pPr>
-      <w:r>
-        <w:rPr>
-          <w:rFonts w:asciiTheme="minorBidi" w:hAnsiTheme="minorBidi"/>
-          <w:sz w:val="20"/>
-          <w:szCs w:val="20"/>
-        </w:rPr>
-        <w:t xml:space="preserve">Click </w:t>
-      </w:r>
-      <w:r>
-        <w:rPr>
-          <w:rFonts w:asciiTheme="minorBidi" w:hAnsiTheme="minorBidi"/>
-          <w:b/>
-          <w:bCs/>
-          <w:sz w:val="20"/>
-          <w:szCs w:val="20"/>
-        </w:rPr>
-        <w:t>File</w:t>
-      </w:r>
-      <w:r>
-        <w:rPr>
-          <w:rFonts w:asciiTheme="minorBidi" w:hAnsiTheme="minorBidi" w:hint="cs"/>
-          <w:b/>
-          <w:bCs/>
-          <w:sz w:val="20"/>
-          <w:szCs w:val="20"/>
-        </w:rPr>
-        <w:t xml:space="preserve"> </w:t>
-      </w:r>
-      <w:r>
-        <w:rPr>
-          <w:rFonts w:asciiTheme="minorBidi" w:hAnsiTheme="minorBidi"/>
-          <w:b/>
-          <w:bCs/>
-          <w:sz w:val="20"/>
-          <w:szCs w:val="20"/>
-        </w:rPr>
-        <w:t>–</w:t>
-      </w:r>
-      <w:r>
-        <w:rPr>
-          <w:rFonts w:asciiTheme="minorBidi" w:hAnsiTheme="minorBidi" w:hint="cs"/>
-          <w:b/>
-          <w:bCs/>
-          <w:sz w:val="20"/>
-          <w:szCs w:val="20"/>
-        </w:rPr>
-        <w:t xml:space="preserve"> </w:t>
-      </w:r>
-      <w:r>
-        <w:rPr>
-          <w:rFonts w:asciiTheme="minorBidi" w:hAnsiTheme="minorBidi"/>
-          <w:b/>
-          <w:bCs/>
-          <w:sz w:val="20"/>
-          <w:szCs w:val="20"/>
-        </w:rPr>
-        <w:t>Open</w:t>
-      </w:r>
-      <w:r>
-        <w:rPr>
-          <w:rFonts w:asciiTheme="minorBidi" w:hAnsiTheme="minorBidi" w:hint="cs"/>
-          <w:b/>
-          <w:bCs/>
-          <w:sz w:val="20"/>
-          <w:szCs w:val="20"/>
-        </w:rPr>
-        <w:t xml:space="preserve"> </w:t>
-      </w:r>
-      <w:r>
-        <w:rPr>
-          <w:rFonts w:asciiTheme="minorBidi" w:hAnsiTheme="minorBidi"/>
-          <w:b/>
-          <w:bCs/>
-          <w:sz w:val="20"/>
-          <w:szCs w:val="20"/>
-        </w:rPr>
-        <w:t>-</w:t>
-      </w:r>
-      <w:r>
-        <w:rPr>
-          <w:rFonts w:asciiTheme="minorBidi" w:hAnsiTheme="minorBidi" w:hint="cs"/>
-          <w:b/>
-          <w:bCs/>
-          <w:sz w:val="20"/>
-          <w:szCs w:val="20"/>
-        </w:rPr>
-        <w:t xml:space="preserve"> </w:t>
-      </w:r>
-      <w:r>
-        <w:rPr>
-          <w:rFonts w:asciiTheme="minorBidi" w:hAnsiTheme="minorBidi"/>
-          <w:b/>
-          <w:bCs/>
-          <w:sz w:val="20"/>
-          <w:szCs w:val="20"/>
-        </w:rPr>
-        <w:t>Project/Solution</w:t>
-      </w:r>
-      <w:r>
-        <w:rPr>
-          <w:rFonts w:asciiTheme="minorBidi" w:hAnsiTheme="minorBidi"/>
-          <w:sz w:val="20"/>
-          <w:szCs w:val="20"/>
-        </w:rPr>
-        <w:t>.</w:t>
-      </w:r>
-    </w:p>
-    <w:p>
-      <w:pPr>
-        <w:pStyle w:val="a3"/>
-        <w:numPr>
-          <w:ilvl w:val="1"/>
-          <w:numId w:val="2"/>
-        </w:numPr>
-        <w:ind w:left="1276" w:hanging="567"/>
-        <w:rPr>
-          <w:rFonts w:asciiTheme="minorBidi" w:hAnsiTheme="minorBidi"/>
-          <w:sz w:val="20"/>
-          <w:szCs w:val="20"/>
-        </w:rPr>
-      </w:pPr>
-      <w:r>
-        <w:rPr>
-          <w:rFonts w:asciiTheme="minorBidi" w:hAnsiTheme="minorBidi"/>
-          <w:sz w:val="20"/>
-          <w:szCs w:val="20"/>
-        </w:rPr>
-        <w:t>Browse to your repository.</w:t>
-      </w:r>
-    </w:p>
-    <w:p>
-      <w:pPr>
-        <w:pStyle w:val="a3"/>
-        <w:numPr>
-          <w:ilvl w:val="1"/>
-          <w:numId w:val="2"/>
-        </w:numPr>
-        <w:ind w:left="1276" w:hanging="567"/>
-        <w:rPr>
-          <w:rFonts w:asciiTheme="minorBidi" w:hAnsiTheme="minorBidi"/>
-          <w:sz w:val="20"/>
-          <w:szCs w:val="20"/>
-        </w:rPr>
-      </w:pPr>
-      <w:r>
-        <w:rPr>
-          <w:rFonts w:asciiTheme="minorBidi" w:hAnsiTheme="minorBidi"/>
-          <w:sz w:val="20"/>
-          <w:szCs w:val="20"/>
-        </w:rPr>
-        <w:t xml:space="preserve">Browse to </w:t>
-      </w:r>
-      <w:proofErr w:type="spellStart"/>
-      <w:r>
-        <w:rPr>
-          <w:rFonts w:asciiTheme="minorBidi" w:hAnsiTheme="minorBidi"/>
-          <w:b/>
-          <w:bCs/>
-          <w:sz w:val="20"/>
-          <w:szCs w:val="20"/>
-        </w:rPr>
-        <w:t>freefalcon</w:t>
-      </w:r>
-      <w:proofErr w:type="spellEnd"/>
-      <w:r>
-        <w:rPr>
-          <w:rFonts w:asciiTheme="minorBidi" w:hAnsiTheme="minorBidi"/>
-          <w:b/>
-          <w:bCs/>
-          <w:sz w:val="20"/>
-          <w:szCs w:val="20"/>
-        </w:rPr>
-        <w:t>-central/</w:t>
-      </w:r>
-      <w:proofErr w:type="spellStart"/>
-      <w:r>
-        <w:rPr>
-          <w:rFonts w:asciiTheme="minorBidi" w:hAnsiTheme="minorBidi"/>
-          <w:b/>
-          <w:bCs/>
-          <w:sz w:val="20"/>
-          <w:szCs w:val="20"/>
-        </w:rPr>
-        <w:t>src</w:t>
-      </w:r>
-      <w:proofErr w:type="spellEnd"/>
-      <w:r>
-        <w:rPr>
-          <w:rFonts w:asciiTheme="minorBidi" w:hAnsiTheme="minorBidi"/>
-          <w:b/>
-          <w:bCs/>
-          <w:sz w:val="20"/>
-          <w:szCs w:val="20"/>
-        </w:rPr>
-        <w:t>/FreeFalcon.sln</w:t>
+          <w:b/>
+          <w:bCs/>
+          <w:sz w:val="20"/>
+          <w:szCs w:val="20"/>
+        </w:rPr>
+        <w:t>FreeFalcon.sln</w:t>
       </w:r>
       <w:r>
         <w:rPr>
@@ -14400,7 +14422,7 @@
 </file>
 
 <file path=customXml/itemProps1.xml><?xml version="1.0" encoding="utf-8"?>
-<ds:datastoreItem xmlns:ds="http://schemas.openxmlformats.org/officeDocument/2006/customXml" ds:itemID="{BEBAAFE1-0370-488F-B801-DDA94F97734E}">
+<ds:datastoreItem xmlns:ds="http://schemas.openxmlformats.org/officeDocument/2006/customXml" ds:itemID="{F3BB7115-959C-4EF8-B7A6-CDE9BE48D1BB}">
   <ds:schemaRefs>
     <ds:schemaRef ds:uri="http://schemas.openxmlformats.org/officeDocument/2006/bibliography"/>
   </ds:schemaRefs>

</xml_diff>